<commit_message>
Inclui campanha paga de lançamento do portal no calendário
Outubro passa a prever uma campanha paga de cadastro (venda
indireta), com verba separada do Always On, rodando cerca de 30
dias na Meta e no Google a partir da data de lançamento (13 ou
20/10). Ajusta a lógica geral do calendário para deixar clara essa
exceção à regra de não haver venda direta.

Co-Authored-By: Claude Sonnet 5 <noreply@anthropic.com>
Claude-Session: https://claude.ai/code/session_01GQSqEjEuqv44iBdACeUWUZ
</commit_message>
<xml_diff>
--- a/eleva/calendario-acoes-marketing-2026-2027.docx
+++ b/eleva/calendario-acoes-marketing-2026-2027.docx
@@ -109,14 +109,14 @@
           <w:sz w:val="21"/>
           <w:szCs w:val="21"/>
         </w:rPr>
-        <w:t xml:space="preserve">Não há venda ativa em nenhum momento deste calendário.</w:t>
-      </w:r>
-      <w:r>
-        <w:rPr>
-          <w:sz w:val="21"/>
-          <w:szCs w:val="21"/>
-        </w:rPr>
-        <w:t xml:space="preserve"> Não estamos fazendo tráfego pago para ofertas pagas, nem abordagem comercial direta. O marketing é só autoridade, audiência, relacionamento e cadastro gratuito no teste do portal. Tudo que é oferta — cursos, sessão estratégica, diagnóstico, mentoria, seguros — fica disponível no link da bio e nas automações, para quem quiser comprar por conta própria.</w:t>
+        <w:t xml:space="preserve">Não há venda direta em nenhum momento deste calendário.</w:t>
+      </w:r>
+      <w:r>
+        <w:rPr>
+          <w:sz w:val="21"/>
+          <w:szCs w:val="21"/>
+        </w:rPr>
+        <w:t xml:space="preserve"> O marketing é autoridade, audiência, relacionamento e cadastro no teste do portal. Tudo que é oferta — cursos, sessão estratégica, diagnóstico, mentoria, seguros — fica disponível no link da bio e nas automações, para quem quiser comprar por conta própria, sem abordagem comercial direta.</w:t>
       </w:r>
     </w:p>
     <w:p>
@@ -125,6 +125,50 @@
       </w:pPr>
       <w:r>
         <w:rPr>
+          <w:sz w:val="21"/>
+          <w:szCs w:val="21"/>
+        </w:rPr>
+        <w:t xml:space="preserve">A exceção é a </w:t>
+      </w:r>
+      <w:r>
+        <w:rPr>
+          <w:b/>
+          <w:bCs/>
+          <w:sz w:val="21"/>
+          <w:szCs w:val="21"/>
+        </w:rPr>
+        <w:t xml:space="preserve">campanha de lançamento do Portal do Síndico</w:t>
+      </w:r>
+      <w:r>
+        <w:rPr>
+          <w:sz w:val="21"/>
+          <w:szCs w:val="21"/>
+        </w:rPr>
+        <w:t xml:space="preserve">, com verba paga separada rodando por cerca de 30 dias tanto na Meta quanto no Google (ver detalhes no mês de outubro, abaixo). Ela não é venda direta, mas uma </w:t>
+      </w:r>
+      <w:r>
+        <w:rPr>
+          <w:b/>
+          <w:bCs/>
+          <w:sz w:val="21"/>
+          <w:szCs w:val="21"/>
+        </w:rPr>
+        <w:t xml:space="preserve">venda indireta</w:t>
+      </w:r>
+      <w:r>
+        <w:rPr>
+          <w:sz w:val="21"/>
+          <w:szCs w:val="21"/>
+        </w:rPr>
+        <w:t xml:space="preserve">: o objetivo é cadastro no teste grátis de 60 dias, para a pessoa só decidir pela compra depois de usar a plataforma. Fora dessa campanha de lançamento, o Always On de engajamento no Instagram segue no ritmo atual, sem aumento de investimento.</w:t>
+      </w:r>
+    </w:p>
+    <w:p>
+      <w:pPr>
+        <w:spacing w:after="160"/>
+      </w:pPr>
+      <w:r>
+        <w:rPr>
           <w:b/>
           <w:bCs/>
           <w:sz w:val="21"/>
@@ -137,7 +181,7 @@
           <w:sz w:val="21"/>
           <w:szCs w:val="21"/>
         </w:rPr>
-        <w:t xml:space="preserve"> o conteúdo educa e gera confiança; o cadastro no portal é o único convite explícito; o link da bio e as automações cuidam do resto. O Giuliano aparece como referência no dia a dia do síndico, e quem se interessar por outras frentes encontra o caminho sozinho.</w:t>
+        <w:t xml:space="preserve"> o conteúdo educa e gera confiança; o cadastro no portal é o convite explícito, tanto no orgânico quanto na campanha paga de lançamento; o link da bio e as automações cuidam do resto. O Giuliano aparece como referência no dia a dia do síndico, e quem se interessar por outras frentes encontra o caminho sozinho.</w:t>
       </w:r>
     </w:p>
     <w:p>
@@ -444,6 +488,43 @@
     </w:p>
     <w:p>
       <w:pPr>
+        <w:spacing w:after="160"/>
+      </w:pPr>
+      <w:r>
+        <w:rPr>
+          <w:b/>
+          <w:bCs/>
+          <w:sz w:val="21"/>
+          <w:szCs w:val="21"/>
+        </w:rPr>
+        <w:t xml:space="preserve">Campanha paga de lançamento (Meta + Google Ads):</w:t>
+      </w:r>
+      <w:r>
+        <w:rPr>
+          <w:sz w:val="21"/>
+          <w:szCs w:val="21"/>
+        </w:rPr>
+        <w:t xml:space="preserve"> a partir da data de lançamento (dia 13 ou dia 20 de outubro, a confirmar), entra uma campanha paga com verba separada do Always On, rodando por cerca de 30 dias nos dois canais. É campanha de </w:t>
+      </w:r>
+      <w:r>
+        <w:rPr>
+          <w:b/>
+          <w:bCs/>
+          <w:sz w:val="21"/>
+          <w:szCs w:val="21"/>
+        </w:rPr>
+        <w:t xml:space="preserve">cadastro</w:t>
+      </w:r>
+      <w:r>
+        <w:rPr>
+          <w:sz w:val="21"/>
+          <w:szCs w:val="21"/>
+        </w:rPr>
+        <w:t xml:space="preserve">, não de venda direta — leva a pessoa a se cadastrar no teste grátis de 60 dias, para decidir pela compra depois de usar a plataforma (venda indireta). A estrutura de Google Ads já está detalhada em documento à parte; a versão Meta segue a mesma lógica de objetivo de cadastro, com os criativos do carrossel e do convite à comunidade já aprovados como ponto de partida.</w:t>
+      </w:r>
+    </w:p>
+    <w:p>
+      <w:pPr>
         <w:pStyle w:val="ListParagraph"/>
         <w:numPr>
           <w:ilvl w:val="0"/>
@@ -465,7 +546,7 @@
           <w:sz w:val="21"/>
           <w:szCs w:val="21"/>
         </w:rPr>
-        <w:t xml:space="preserve"> teaser do portal no Instagram, e-mail de lançamento, acesso antecipado e convite pessoal do Giuliano na comunidade do WhatsApp.</w:t>
+        <w:t xml:space="preserve"> teaser do portal no Instagram, e-mail de lançamento, acesso antecipado e convite pessoal do Giuliano na comunidade do WhatsApp. Ajustar o início exato da campanha paga para a semana da data de lançamento confirmada (13 ou 20/10).</w:t>
       </w:r>
     </w:p>
     <w:p>

</xml_diff>

<commit_message>
Corrige "Strategia" e confirma Beto/Mari, acrescenta pendências de vídeo e nova data de captação
- Corrige o nome da empresa de "Straategia" para "Strategia".
- Confirma que Beto é o rosto da Corretora de Seguros e Mari do Hub
  de Negócios, removendo a necessidade de confirmar com o Giuliano.
- Acrescenta pendência de verificar com o Giuliano os vídeos que
  ele ficou de gravar e o prazo de entrega.
- Registra que a captação de conteúdo na Strategia não aconteceu
  essa semana por chuva, remarcada para o dia 15, e que é preciso
  confirmar se o Giuliano quer participar para reservar uma hora.

Co-Authored-By: Claude Sonnet 5 <noreply@anthropic.com>
Claude-Session: https://claude.ai/code/session_01GQSqEjEuqv44iBdACeUWUZ
</commit_message>
<xml_diff>
--- a/eleva/calendario-acoes-marketing-2026-2027.docx
+++ b/eleva/calendario-acoes-marketing-2026-2027.docx
@@ -989,7 +989,7 @@
           <w:sz w:val="21"/>
           <w:szCs w:val="21"/>
         </w:rPr>
-        <w:t xml:space="preserve">Observação: pedir para cada um dos integrantes da Straategia dar o depoimento, para usarmos como material.</w:t>
+        <w:t xml:space="preserve">Observação: pedir para cada um dos integrantes da Strategia dar o depoimento, para usarmos como material.</w:t>
       </w:r>
     </w:p>
     <w:p>
@@ -2360,12 +2360,10 @@
       </w:pPr>
       <w:r>
         <w:rPr>
-          <w:i/>
-          <w:iCs/>
-          <w:sz w:val="21"/>
-          <w:szCs w:val="21"/>
-        </w:rPr>
-        <w:t xml:space="preserve">Confirmar os nomes exatos — Beto e Mari cuidam de Corretora de Seguros e Hub de Negócios, mas vale confirmar com o Giuliano quem está em cada frente antes de formalizar o convite.</w:t>
+          <w:sz w:val="21"/>
+          <w:szCs w:val="21"/>
+        </w:rPr>
+        <w:t xml:space="preserve">Beto é o rosto da Eleva Corretora de Seguros, e Mari é o rosto da Eleva Hub de Negócios — por isso cada um entra só na frente que representa.</w:t>
       </w:r>
     </w:p>
     <w:p>
@@ -3382,7 +3380,7 @@
           <w:sz w:val="21"/>
           <w:szCs w:val="21"/>
         </w:rPr>
-        <w:t xml:space="preserve">6. Avaliar com o Beto (Hub de Seguros) e a Mari a possibilidade de um vídeo deles para a live/conteúdo de Corretora de Seguros em maio.</w:t>
+        <w:t xml:space="preserve">6. Gravar com o Beto (Corretora de Seguros) e a Mari (Hub de Negócios) os vídeos deles para as respectivas lives/conteúdos em maio e junho.</w:t>
       </w:r>
     </w:p>
     <w:p>
@@ -3400,6 +3398,72 @@
           <w:szCs w:val="21"/>
         </w:rPr>
         <w:t xml:space="preserve">7. </w:t>
+      </w:r>
+      <w:r>
+        <w:rPr>
+          <w:b/>
+          <w:bCs/>
+          <w:sz w:val="21"/>
+          <w:szCs w:val="21"/>
+        </w:rPr>
+        <w:t xml:space="preserve">Verificar com o Giuliano as pendências de vídeo que ele ficou de gravar</w:t>
+      </w:r>
+      <w:r>
+        <w:rPr>
+          <w:sz w:val="21"/>
+          <w:szCs w:val="21"/>
+        </w:rPr>
+        <w:t xml:space="preserve"> — quando ele consegue entregar.</w:t>
+      </w:r>
+    </w:p>
+    <w:p>
+      <w:pPr>
+        <w:pStyle w:val="ListParagraph"/>
+        <w:numPr>
+          <w:ilvl w:val="0"/>
+          <w:numId w:val="2"/>
+        </w:numPr>
+        <w:spacing w:after="80"/>
+      </w:pPr>
+      <w:r>
+        <w:rPr>
+          <w:sz w:val="21"/>
+          <w:szCs w:val="21"/>
+        </w:rPr>
+        <w:t xml:space="preserve">8. </w:t>
+      </w:r>
+      <w:r>
+        <w:rPr>
+          <w:b/>
+          <w:bCs/>
+          <w:sz w:val="21"/>
+          <w:szCs w:val="21"/>
+        </w:rPr>
+        <w:t xml:space="preserve">Captação de conteúdo na Strategia:</w:t>
+      </w:r>
+      <w:r>
+        <w:rPr>
+          <w:sz w:val="21"/>
+          <w:szCs w:val="21"/>
+        </w:rPr>
+        <w:t xml:space="preserve"> não aconteceu essa semana por causa da chuva. Nova data marcada para o dia 15, semana que vem — confirmar se o Giuliano também quer participar, para já reservar uma hora só para gravar ele.</w:t>
+      </w:r>
+    </w:p>
+    <w:p>
+      <w:pPr>
+        <w:pStyle w:val="ListParagraph"/>
+        <w:numPr>
+          <w:ilvl w:val="0"/>
+          <w:numId w:val="2"/>
+        </w:numPr>
+        <w:spacing w:after="80"/>
+      </w:pPr>
+      <w:r>
+        <w:rPr>
+          <w:sz w:val="21"/>
+          <w:szCs w:val="21"/>
+        </w:rPr>
+        <w:t xml:space="preserve">9. </w:t>
       </w:r>
       <w:r>
         <w:rPr>

</xml_diff>